<commit_message>
Expand workflow draft with practical example
</commit_message>
<xml_diff>
--- a/docs/guides/Delphi Web Studio Workflow DRAFT.docx
+++ b/docs/guides/Delphi Web Studio Workflow DRAFT.docx
@@ -117,7 +117,7 @@
         <w:br/>
       </w:r>
       <w:r>
-        <w:t>Set links and preserve navigation  7</w:t>
+        <w:t>Set links and preserve navigation  8</w:t>
         <w:br/>
       </w:r>
       <w:r>
@@ -129,7 +129,7 @@
         <w:br/>
       </w:r>
       <w:r>
-        <w:t>Understand the desktop menus and status line  8</w:t>
+        <w:t>Understand the desktop menus and status line  9</w:t>
         <w:br/>
       </w:r>
       <w:r>
@@ -137,11 +137,23 @@
         <w:br/>
       </w:r>
       <w:r>
-        <w:t>Finish and resume later  9</w:t>
+        <w:t>Worked example A small community website  9</w:t>
         <w:br/>
       </w:r>
       <w:r>
-        <w:t>Evidence and limitations  9</w:t>
+        <w:t>Component reference Common page sections  10</w:t>
+        <w:br/>
+      </w:r>
+      <w:r>
+        <w:t>Troubleshooting common workflow problems  11</w:t>
+        <w:br/>
+      </w:r>
+      <w:r>
+        <w:t>Finish and resume later  12</w:t>
+        <w:br/>
+      </w:r>
+      <w:r>
+        <w:t>Evidence and limitations  12</w:t>
         <w:br/>
       </w:r>
       <w:r>
@@ -640,7 +652,7 @@
         <w:pStyle w:val="ListNumber"/>
       </w:pPr>
       <w:r>
-        <w:t>Select the page you want to treat as an article and open its article controls. Enter the available title, summary, author, dates and tags as appropriate. These fields describe the article; they do not establish a public author account or a permissions system.</w:t>
+        <w:t>Select a non-Home page and open the Articles tab. Choose Make this page an article. The page name and path serve as its title and address. Enter an author, summary and optional tags. Creation and modification timestamps are stored automatically. These fields do not establish a public author account or a permissions system.</w:t>
       </w:r>
     </w:p>
     <w:p>
@@ -853,6 +865,215 @@
     <w:p>
       <w:r>
         <w:t>External images, video services, optional analytics and optional cloud AI can contact outside services. Local project editing and local export do not require publication. Review the destination, credentials and information sent whenever you choose an online feature.</w:t>
+      </w:r>
+    </w:p>
+    <w:p>
+      <w:pPr>
+        <w:pStyle w:val="Heading1"/>
+      </w:pPr>
+      <w:r>
+        <w:t>Worked example A small community website</w:t>
+      </w:r>
+    </w:p>
+    <w:p>
+      <w:r>
+        <w:t>This example uses fictional information. Replace the names, wording, addresses and images with information you have permission to publish. The example ends with a local export; it does not upload the site.</w:t>
+      </w:r>
+    </w:p>
+    <w:p>
+      <w:pPr>
+        <w:pStyle w:val="ListNumber"/>
+      </w:pPr>
+      <w:r>
+        <w:t>Open the dashboard and choose the Community starter. The editor opens with a Home page and editable starter sections. Return to Projects when needed; the project card can be renamed with its pencil button. Project name and public site name are separate values.</w:t>
+      </w:r>
+    </w:p>
+    <w:p>
+      <w:pPr>
+        <w:pStyle w:val="ListNumber"/>
+      </w:pPr>
+      <w:r>
+        <w:t>Select the Home page Hero. In Properties, replace Headline and Subheadline with your own text. Edit the Primary CTA label and destination or clear them if the button is not needed. Choose a Hero layout from the available variants. A selected Hero image is displayed in the split layout.</w:t>
+      </w:r>
+    </w:p>
+    <w:p>
+      <w:pPr>
+        <w:pStyle w:val="ListNumber"/>
+      </w:pPr>
+      <w:r>
+        <w:t>Choose Add page, enter About and a unique path such as /about, and add it. Select Components, add a Content section, then select the new section and type the organization's real description. Use Bold, Heading or List on selected text as needed.</w:t>
+      </w:r>
+    </w:p>
+    <w:p>
+      <w:pPr>
+        <w:pStyle w:val="ListNumber"/>
+      </w:pPr>
+      <w:r>
+        <w:t>Add a News page. Open Articles and choose Make this page an article if it represents one article. Enter an author and summary. Leave it Draft while writing, and mark it Ready only when it should appear in the next export. For several articles, create separate non-Home pages.</w:t>
+      </w:r>
+    </w:p>
+    <w:p>
+      <w:pPr>
+        <w:pStyle w:val="ListNumber"/>
+      </w:pPr>
+      <w:r>
+        <w:t>Add a Documents page. Open Media, choose the community's bulletin PDF and import it. Add a PDF Viewer section to Documents and choose the imported bulletin. Enter a useful title and accessibility label, test the preview and set Mobile display if a link is preferred on small screens.</w:t>
+      </w:r>
+    </w:p>
+    <w:p>
+      <w:pPr>
+        <w:pStyle w:val="ListNumber"/>
+      </w:pPr>
+      <w:r>
+        <w:t>Add a Contact page with a Content section containing ordinary contact details. A contact form needs a configured HTTPS service or the supported email-draft option; merely placing a Contact section does not guarantee that messages will be delivered. Do not invent an email address or service endpoint.</w:t>
+      </w:r>
+    </w:p>
+    <w:p>
+      <w:pPr>
+        <w:pStyle w:val="ListNumber"/>
+      </w:pPr>
+      <w:r>
+        <w:t>Select the Navbar and add destinations to About, News, Documents and Contact using the page chooser. Draft articles are omitted from the chooser. Inspect the Footer, enter your chosen copyright or attribution, and add only links you actually want. Share the header or footer across pages if appropriate.</w:t>
+      </w:r>
+    </w:p>
+    <w:p>
+      <w:pPr>
+        <w:pStyle w:val="ListNumber"/>
+      </w:pPr>
+      <w:r>
+        <w:t>Open Settings &gt; General to enter the public site name and description. In SEO, provide a page title and description. Leave the public site URL empty until the destination is known; the field can later include an appropriate site subfolder.</w:t>
+      </w:r>
+    </w:p>
+    <w:p>
+      <w:pPr>
+        <w:pStyle w:val="ListNumber"/>
+      </w:pPr>
+      <w:r>
+        <w:t>Save the project to a new file. With imported media, expect a WebStudio project ZIP containing the manifest and media. Reopen a separate copy and check that the pages, links and PDF are present. Keep a second copy on another drive.</w:t>
+      </w:r>
+    </w:p>
+    <w:p>
+      <w:pPr>
+        <w:pStyle w:val="ListNumber"/>
+      </w:pPr>
+      <w:r>
+        <w:t>Check site, resolve the issues you understand, and inspect every page at mobile, tablet and desktop widths. Use Export to create a separate website ZIP. Extract it in a test folder and review it locally, using a local web server when needed for the PDF viewer. No public website has been created by these steps.</w:t>
+      </w:r>
+    </w:p>
+    <w:p>
+      <w:pPr>
+        <w:pStyle w:val="Heading1"/>
+      </w:pPr>
+      <w:r>
+        <w:t>Component reference Common page sections</w:t>
+      </w:r>
+    </w:p>
+    <w:p>
+      <w:r>
+        <w:t>The list below describes editable controls visible in the current source. The available choices depend on the section selected. New empty repeated-item sections need your own entries; they should not be mistaken for finished content.</w:t>
+      </w:r>
+    </w:p>
+    <w:p>
+      <w:r>
+        <w:t>Navbar: enter Logo Text or choose a logo image, add a CTA Button label and CTA Destination if desired, and manage Navigation destinations. The default and centered variants arrange the header differently. Legacy text-only labels are preserved as labels rather than silently made into links.</w:t>
+      </w:r>
+    </w:p>
+    <w:p>
+      <w:r>
+        <w:t>Hero: enter Badge, Headline, Subheadline, primary and secondary call-to-action labels and their destinations. Variants are centered, split, gradient and minimal. A hero image chooser is available; the documented split layout uses it. Check a button destination after changing page paths.</w:t>
+      </w:r>
+    </w:p>
+    <w:p>
+      <w:r>
+        <w:t>Features: provide Section Label, Title and Subtitle, then add or edit Feature Cards. Choose grid, list or alternating layout. Add truthful descriptions and choose images where offered. Items start empty in new sections.</w:t>
+      </w:r>
+    </w:p>
+    <w:p>
+      <w:r>
+        <w:t>CTA: supply Headline, Subheadline, Button Text and Button URL. The simple and split variants change the arrangement. A call to action is an ordinary link; the app does not promise the destination exists.</w:t>
+      </w:r>
+    </w:p>
+    <w:p>
+      <w:r>
+        <w:t>Footer: enter Logo Text, logo image, Description and Copyright, and add Navigation destinations. Simple, multi-column and minimal variants present different layouts; the minimal layout does not display the logo. The copyright field can contain your own author or organization credit.</w:t>
+      </w:r>
+    </w:p>
+    <w:p>
+      <w:r>
+        <w:t>Testimonials, Stats and FAQ: enter titles or subtitles and add your own testimonial entries, statistic entries or questions and answers. Testimonial variants include cards, carousel and spotlight; statistics include grid, bar and counter. Verify all claims and do not leave invented endorsements or figures.</w:t>
+      </w:r>
+    </w:p>
+    <w:p>
+      <w:r>
+        <w:t>Team and Logo Cloud: add your own member information or logo labels in their item controls. Image selection is available for team members where offered. Obtain permission to use names, portraits and marks.</w:t>
+      </w:r>
+    </w:p>
+    <w:p>
+      <w:r>
+        <w:t>Content: type or paste text in Body and select prose, columns or highlight style. Select text before applying the available formatting buttons. Use the page-link or media-link controls to insert references, then verify the exported destinations.</w:t>
+      </w:r>
+    </w:p>
+    <w:p>
+      <w:r>
+        <w:t>Image and Gallery: choose an image from Media or use a suitable URL, provide meaningful Alt Text, and enter optional title or subtitle. Image offers hero-image, side-by-side and grid variants; Gallery offers grid and masonry. An external URL may require a network connection and can stop working if its owner removes it.</w:t>
+      </w:r>
+    </w:p>
+    <w:p>
+      <w:r>
+        <w:t>Video: enter a supported YouTube or Vimeo address, a title and the appropriate platform selection. Playback depends on that service and its network and privacy settings. Check site can flag unsupported address formats, but does not prove that a video exists or will play.</w:t>
+      </w:r>
+    </w:p>
+    <w:p>
+      <w:r>
+        <w:t>Divider and Banner: use Divider to add a line, space or dots, with a width and height. Banner provides text, link text and a destination, with ribbon or bar styling. Check that a banner's destination remains valid.</w:t>
+      </w:r>
+    </w:p>
+    <w:p>
+      <w:r>
+        <w:t>Contact and Newsletter: enter the available title and descriptive text. Contact can use a service HTTPS URL, consent notice and contact email where configured. Newsletter has content and button wording, but adding it alone does not connect a mailing-list provider. Review privacy notices and verify the actual destination and service separately.</w:t>
+      </w:r>
+    </w:p>
+    <w:p>
+      <w:r>
+        <w:t>Document, Document library, Audio, local video and PDF Viewer: select an appropriate media item and edit the properties supplied for the section. Document library items have titles and descriptions and can be filtered by those values; it does not search the contents of the underlying documents. PDF Viewer has separate page, fit, search, thumbnail, download, print, fullscreen and mobile choices.</w:t>
+      </w:r>
+    </w:p>
+    <w:p>
+      <w:pPr>
+        <w:pStyle w:val="Heading1"/>
+      </w:pPr>
+      <w:r>
+        <w:t>Troubleshooting common workflow problems</w:t>
+      </w:r>
+    </w:p>
+    <w:p>
+      <w:r>
+        <w:t>The project is missing from the dashboard: check the project filter and search text first. Drafts and revisions are tied to the local WebView profile. If you saved a separate project file, use Open project to create an independent draft from it. Do not clear local storage before recovering needed work.</w:t>
+      </w:r>
+    </w:p>
+    <w:p>
+      <w:r>
+        <w:t>The app rejects a project: read the message, keep the source file unchanged and check its format and version. Unsupported blocks are retained where possible; a website export can be stopped instead of silently dropping content. A malformed ZIP, invalid path, duplicate identity or invalid UTF-8 can prevent opening.</w:t>
+      </w:r>
+    </w:p>
+    <w:p>
+      <w:r>
+        <w:t>An imported page looks different: the importers convert only supported content. Examine the import report and retained source. Layout, plugins, styling, scripts, attachments or unrecognized links may need manual rebuilding. Compare with the original and retain it as your reference.</w:t>
+      </w:r>
+    </w:p>
+    <w:p>
+      <w:r>
+        <w:t>A file or PDF does not show: check that it was imported to the current project's Media library and selected in the section. Verify any reported checksum or missing-media warning. If the exported PDF viewer does not run from a file address, test the extracted site through a local web server. A network-hosted video requires its external provider.</w:t>
+      </w:r>
+    </w:p>
+    <w:p>
+      <w:r>
+        <w:t>An export stops: read the reported page, missing media, unsupported block, conflicting filename or link. Correct the identified item and export again. Save the editable project separately before experimenting. Check site does not verify all external links, custom code, visual layouts or overall accessibility.</w:t>
+      </w:r>
+    </w:p>
+    <w:p>
+      <w:r>
+        <w:t>A save was interrupted: keep the original and any recovery ZIP. Inspect the status for the staged path; use Recover staged file only to create a new name, then open the result and inspect it. If recovery fails, use a verified earlier copy. Do not assume that a temporary file contains a complete project.</w:t>
       </w:r>
     </w:p>
     <w:p>

</xml_diff>